<commit_message>
Rapor sadelestirildi ve GitHub linki eklendi
</commit_message>
<xml_diff>
--- a/HIGGS_ML_Rapor.docx
+++ b/HIGGS_ML_Rapor.docx
@@ -223,7 +223,7 @@
         <w:jc w:val="both"/>
       </w:pPr>
       <w:r>
-        <w:t xml:space="preserve">Bu projede, yüksek enerji fiziğinden gelen büyük ve çok özellikli HIGGS veri seti üzerinde uçtan uca bir makine öğrenmesi pipeline'ı kurulmuştur. Amaç, makine öğrenmesi sürecinin iki kritik bileşenini — öznitelik seçimi (feature selection) ve hiperparametre ayarlaması (hyperparameter tuning) — sistematik biçimde uygulamak ve dört farklı algoritmayı tarafsız bir şekilde karşılaştırmaktır.</w:t>
+        <w:t xml:space="preserve">Bu projede, HIGGS veri seti üzerinde uçtan uca bir makine öğrenmesi pipeline'ı kurulmuştur. Amaç, sürecin iki kritik adımını — öznitelik seçimi ve hiperparametre ayarlaması — sistematik biçimde uygulamak ve dört modeli tarafsız karşılaştırmaktır.</w:t>
       </w:r>
     </w:p>
     <w:p>
@@ -236,10 +236,10 @@
           <w:b/>
           <w:bCs/>
         </w:rPr>
-        <w:t xml:space="preserve">Yapılan adımlar: </w:t>
-      </w:r>
-      <w:r>
-        <w:t xml:space="preserve">(1) IQR yöntemi ile aykırı değer analizi ve sınırlama, (2) MinMaxScaler ile ölçekleme, (3) ANOVA F-score tabanlı filtre yöntemiyle öznitelik seçimi, (4) Nested Cross-Validation ile hiperparametre araması, (5) KNN, SVM, MLP ve XGBoost modellerinin Accuracy, Precision, Recall, F1 ve ROC-AUC metrikleriyle karşılaştırılması, (6) ROC eğrilerinin (OVA) çizimi ve en başarılı modelin yorumlanması.</w:t>
+        <w:t xml:space="preserve">Adımlar: </w:t>
+      </w:r>
+      <w:r>
+        <w:t xml:space="preserve">IQR ile aykırı değer sınırlama → MinMax ölçekleme → ANOVA ile öznitelik seçimi → Nested CV ile hiperparametre araması → KNN, SVM, MLP, XGBoost karşılaştırması (Accuracy, Precision, Recall, F1, ROC-AUC) → ROC eğrileri ve en iyi modelin yorumu.</w:t>
       </w:r>
     </w:p>
     <w:p>
@@ -252,10 +252,10 @@
           <w:b/>
           <w:bCs/>
         </w:rPr>
-        <w:t xml:space="preserve">Donanım/ortam: </w:t>
-      </w:r>
-      <w:r>
-        <w:t xml:space="preserve">Eğitim, NVIDIA RTX 3060 GPU üzerinde CUDA ile hızlandırılmıştır. XGBoost doğal CUDA desteğiyle, MLP ise PyTorch ile GPU üzerinde eğitilmiştir. Toplam çalışma süresi yaklaşık 27 dakikadır.</w:t>
+        <w:t xml:space="preserve">Ortam: </w:t>
+      </w:r>
+      <w:r>
+        <w:t xml:space="preserve">Eğitim NVIDIA RTX 3060 GPU (CUDA) üzerinde yapılmıştır; XGBoost doğal CUDA, MLP ise PyTorch ile GPU'da çalışır. Toplam süre ~27 dakika.</w:t>
       </w:r>
     </w:p>
     <w:p>
@@ -272,7 +272,7 @@
         <w:jc w:val="both"/>
       </w:pPr>
       <w:r>
-        <w:t xml:space="preserve">HIGGS veri seti (UCI Machine Learning Repository), parçacık çarpıştırıcısı simülasyonlarından üretilmiş 11 milyon örnek ve 28 özellik içeren ikili bir sınıflandırma problemidir. Sınıflar: sinyal (Higgs bozonu üreten süreç, etiket=1) ve arka plan (etiket=0). İlk 21 özellik düşük seviyeli kinematik ölçümler, son 7 özellik ise fizikçiler tarafından türetilmiş yüksek seviyeli kütle değişkenleridir (m_jj, m_bb, m_wwbb vb.). Ödev gereği rastgele 100.000 örnek kullanılmıştır.</w:t>
+        <w:t xml:space="preserve">HIGGS veri seti (UCI), parçacık çarpıştırıcısı simülasyonlarından üretilmiş 11 milyon örnek ve 28 özellikli ikili bir sınıflandırma problemidir: sinyal (Higgs bozonu, etiket=1) ve arka plan (etiket=0). İlk 21 özellik düşük seviyeli kinematik ölçümler, son 7'si türetilmiş yüksek seviyeli kütle değişkenleridir (m_bb, m_wwbb vb.). Ödev gereği rastgele 100.000 örnek kullanılmıştır.</w:t>
       </w:r>
     </w:p>
     <w:tbl>
@@ -743,7 +743,7 @@
         <w:jc w:val="both"/>
       </w:pPr>
       <w:r>
-        <w:t xml:space="preserve">Her özellik için çeyrekler açıklığı (IQR = Q3 − Q1) hesaplanmış, [Q1 − 1,5·IQR, Q3 + 1,5·IQR] aralığı dışındaki değerler aykırı kabul edilmiştir. Aykırı değerler silinmek yerine sınır değerlere kırpılmıştır (capping/clipping); böylece veri kaybı yaşanmadan uç değerlerin model üzerindeki olumsuz etkisi azaltılmıştır. En çok aykırı değer içeren özellikler türetilmiş kütle değişkenleridir:</w:t>
+        <w:t xml:space="preserve">Her özellik için IQR = Q3 − Q1 hesaplanmış; [Q1 − 1,5·IQR, Q3 + 1,5·IQR] dışındaki değerler aykırı kabul edilmiştir. Veri kaybını önlemek için aykırı değerler silinmeyip sınır değerlere kırpılmıştır (capping). En çok aykırı değer içeren özellikler türetilmiş kütle değişkenleridir:</w:t>
       </w:r>
     </w:p>
     <w:tbl>
@@ -1490,7 +1490,7 @@
         <w:jc w:val="both"/>
       </w:pPr>
       <w:r>
-        <w:t xml:space="preserve">Tüm sayısal özellikler MinMaxScaler ile [0, 1] aralığına dönüştürülmüştür. Ölçekleme özellikle mesafe tabanlı KNN ve marjin tabanlı SVM için kritiktir; ayrıca MLP'nin daha hızlı ve kararlı yakınsamasını sağlar. Veri sızıntısını (data leakage) önlemek için ölçekleme, pipeline içinde her eğitim katına ayrı ayrı uygulanmıştır (test katından bilgi sızdırılmaz).</w:t>
+        <w:t xml:space="preserve">Tüm özellikler MinMaxScaler ile [0, 1] aralığına dönüştürülmüştür. Ölçekleme mesafe tabanlı KNN ve marjin tabanlı SVM için kritiktir, MLP'nin yakınsamasını da hızlandırır. Veri sızıntısını önlemek için ölçekleme pipeline içinde her eğitim katına ayrı uygulanır.</w:t>
       </w:r>
     </w:p>
     <w:p>
@@ -1507,7 +1507,7 @@
         <w:jc w:val="both"/>
       </w:pPr>
       <w:r>
-        <w:t xml:space="preserve">Filtre tabanlı yöntem olarak ANOVA F-score kullanılmış ve en yüksek skora sahip 15 özellik seçilmiştir (referans olarak Mutual Information skorları da hesaplanmıştır). ANOVA F-score, bir özelliğin sınıflar arasında ne kadar ayırt edici olduğunu ölçer; yüksek skor, sinyal ve arka plan sınıflarının o özellik üzerinde belirgin biçimde farklılaştığını gösterir.</w:t>
+        <w:t xml:space="preserve">Filtre yöntemi olarak ANOVA F-score kullanılmış ve en yüksek skorlu 15 özellik seçilmiştir (Mutual Information skorları referans olarak da hesaplanmıştır). ANOVA F-score, bir özelliğin sınıfları ne kadar ayırt ettiğini ölçer; yüksek skor güçlü ayrım demektir.</w:t>
       </w:r>
     </w:p>
     <w:p>
@@ -1520,7 +1520,7 @@
           <w:b/>
           <w:bCs/>
         </w:rPr>
-        <w:t xml:space="preserve">Seçilen 15 özellik (ANOVA F-score sırasıyla): </w:t>
+        <w:t xml:space="preserve">Seçilen 15 özellik (sırayla): </w:t>
       </w:r>
       <w:r>
         <w:t xml:space="preserve">m_bb, m_wwbb, missing_energy_magnitude, m_wbb, jet1_pt, jet2_b_tag, jet4_pt, lepton_pT, m_jjj, jet3_b_tag, jet4_b_tag, jet2_pt, m_lv, m_jj, jet1_b_tag.</w:t>
@@ -1532,7 +1532,7 @@
         <w:jc w:val="both"/>
       </w:pPr>
       <w:r>
-        <w:t xml:space="preserve">Dikkat çekici biçimde en ayırt edici özellikler, fizikçilerin türettiği yüksek seviyeli kütle değişkenleridir (m_bb ≈ 1971, m_wwbb ≈ 1905). Bu, yüksek seviyeli fiziksel bilginin sinyal/arka plan ayrımında ham kinematik ölçümlerden çok daha güçlü olduğunu doğrular.</w:t>
+        <w:t xml:space="preserve">En ayırt edici özellikler türetilmiş kütle değişkenleridir (m_bb ≈ 1971, m_wwbb ≈ 1905) — yani yüksek seviyeli fiziksel bilgi, ham kinematik ölçümlerden çok daha güçlüdür.</w:t>
       </w:r>
     </w:p>
     <w:tbl>
@@ -4286,7 +4286,7 @@
         <w:jc w:val="both"/>
       </w:pPr>
       <w:r>
-        <w:t xml:space="preserve">Tüm metriklerde sıralama tutarlıdır: </w:t>
+        <w:t xml:space="preserve">Sıralama tüm metriklerde tutarlıdır: </w:t>
       </w:r>
       <w:r>
         <w:rPr>
@@ -4296,7 +4296,7 @@
         <w:t xml:space="preserve">XGBoost &gt; MLP &gt; SVM &gt; KNN</w:t>
       </w:r>
       <w:r>
-        <w:t xml:space="preserve">. XGBoost, en yüksek ROC-AUC (0,797) ve doğruluk (%72,1) değerlerine ulaşmıştır. Standart sapmaların küçük olması (XGBoost AUC std = 0,005) sonuçların kararlı ve katlar arası tutarlı olduğunu gösterir. KNN ve SVM'in daha düşük performansı, kısmen 2.000 örneklik alt-örneklemle eğitilmelerinden kaynaklanmaktadır.</w:t>
+        <w:t xml:space="preserve">. XGBoost en yüksek ROC-AUC (0,797) ve doğruluğa (%72,1) ulaşmıştır; küçük standart sapma (AUC std = 0,005) sonuçların kararlı olduğunu gösterir. KNN ve SVM'in daha düşük kalmasında 2.000 örneklik alt-örneklem de etkilidir.</w:t>
       </w:r>
     </w:p>
     <w:p>
@@ -4375,7 +4375,7 @@
         <w:jc w:val="both"/>
       </w:pPr>
       <w:r>
-        <w:t xml:space="preserve">ROC eğrisi, sınıflandırma eşiği değiştirilirken Doğru Pozitif Oranı (TPR) ile Yanlış Pozitif Oranı (FPR) arasındaki dengeyi gösterir. Eğri sol-üst köşeye ne kadar yakınsa model o kadar başarılıdır; eğri altındaki alan (AUC) tek bir sayıyla ayırt etme gücünü özetler. Aşağıda dört modelin birleştirilmiş (out-of-fold) ROC eğrileri görülmektedir.</w:t>
+        <w:t xml:space="preserve">ROC eğrisi, eşik değiştikçe Doğru Pozitif (TPR) ve Yanlış Pozitif (FPR) oranları arasındaki dengeyi gösterir; eğri sol-üst köşeye yaklaştıkça model daha iyidir ve altındaki alan (AUC) ayırt etme gücünü tek sayıyla özetler. Aşağıda dört modelin out-of-fold ROC eğrileri yer alır.</w:t>
       </w:r>
     </w:p>
     <w:p>
@@ -5088,7 +5088,7 @@
         <w:t xml:space="preserve">Neden XGBoost? </w:t>
       </w:r>
       <w:r>
-        <w:t xml:space="preserve">HIGGS gibi yapılandırılmış (tablo) verilerde gradyan artırmalı ağaçlar genellikle en güçlü yöntemdir. XGBoost, özellikler arası doğrusal olmayan etkileşimleri (örneğin türetilmiş kütle değişkenleri arasındaki ilişkileri) ağaç yapısıyla doğal olarak yakalar; düzenlileştirme (regularization) ve subsample/colsample mekanizmalarıyla aşırı öğrenmeye karşı dayanıklıdır. MLP ikinci sırada gelmiştir; doğrusal olmayan ilişkileri öğrenebilse de küçük mimarilerle ağaç tabanlı modelin gerisinde kalmıştır. SVM ve KNN ise hem alt-örneklem kısıtı hem de yüksek boyutlu, gürültülü fiziksel veride mesafe/marjin tabanlı yaklaşımların sınırları nedeniyle daha düşük performans göstermiştir.</w:t>
+        <w:t xml:space="preserve">HIGGS gibi tablo verilerinde gradyan artırmalı ağaçlar genellikle en güçlü yöntemdir; özellikler arası doğrusal olmayan etkileşimleri doğal olarak yakalar ve düzenlileştirme ile aşırı öğrenmeye dayanıklıdır. MLP ikinci sırada, doğrusal olmayan ilişkileri öğrenir ama küçük mimaride ağacın gerisinde kalır. SVM ve KNN ise alt-örneklem kısıtı ve yüksek boyutlu gürültülü veride mesafe/marjin yaklaşımlarının sınırları nedeniyle daha düşük kalmıştır.</w:t>
       </w:r>
     </w:p>
     <w:p>
@@ -5104,7 +5104,7 @@
         <w:t xml:space="preserve">Bağımsız doğrulama (tahmin.ipynb): </w:t>
       </w:r>
       <w:r>
-        <w:t xml:space="preserve">Kaydedilen en iyi model (model.joblib) yüklenip, eğitimde kullanılmayan 10.000 rastgele HIGGS örneği üzerinde test edilmiştir. Elde edilen doğruluk %72,76 olup, Nested CV'deki %72,1 değeriyle son derece tutarlıdır. Bu, modelin genelleme performansının güvenilir olduğunu ve aşırı öğrenme yaşanmadığını gösterir.</w:t>
+        <w:t xml:space="preserve">Kaydedilen model, eğitimde kullanılmayan 10.000 örnekte %72,76 doğruluk vermiştir — Nested CV'deki %72,1 ile tutarlı. Bu, modelin güvenilir genellediğini ve aşırı öğrenme olmadığını gösterir.</w:t>
       </w:r>
     </w:p>
     <w:p>
@@ -5117,10 +5117,10 @@
           <w:b/>
           <w:bCs/>
         </w:rPr>
-        <w:t xml:space="preserve">Veri temsili kombinasyonu yorumu: </w:t>
-      </w:r>
-      <w:r>
-        <w:t xml:space="preserve">En iyi sonuç, “ANOVA ile seçilmiş 15 öznitelik + XGBoost” kombinasyonundan gelmiştir. Öznitelik seçiminin k=15'te en iyi olması, 28 özelliğin yarısının (özellikle düşük ANOVA skorlu açısal phi/eta değişkenlerinin) modele gürültü kattığını; bilgilendirici kütle ve momentum değişkenlerine odaklanmanın hem performansı koruduğunu hem de modeli sadeleştirdiğini ortaya koymaktadır.</w:t>
+        <w:t xml:space="preserve">En iyi kombinasyon: </w:t>
+      </w:r>
+      <w:r>
+        <w:t xml:space="preserve">“ANOVA ile seçilmiş 15 öznitelik + XGBoost”. k=15'in en iyi çıkması, düşük skorlu açısal (phi/eta) değişkenlerin gürültü kattığını ve bilgilendirici kütle/momentum değişkenlerine odaklanmanın daha iyi olduğunu gösterir.</w:t>
       </w:r>
     </w:p>
     <w:p>
@@ -5137,7 +5137,7 @@
         <w:jc w:val="both"/>
       </w:pPr>
       <w:r>
-        <w:t xml:space="preserve">Bu çalışmada HIGGS veri seti üzerinde uçtan uca bir makine öğrenmesi pipeline'ı kurulmuş; IQR ile aykırı değer kırpma, MinMax ölçekleme, ANOVA tabanlı öznitelik seçimi ve Nested Cross-Validation ile hiperparametre optimizasyonu uygulanmıştır. Dört model tarafsız biçimde karşılaştırılmış ve XGBoost (ROC-AUC 0,797, doğruluk %72,1) en başarılı model olarak belirlenmiştir. Sonuçlar, bağımsız bir test kümesinde (%72,76 doğruluk) doğrulanmıştır.</w:t>
+        <w:t xml:space="preserve">HIGGS veri seti üzerinde IQR kırpma, MinMax ölçekleme, ANOVA öznitelik seçimi ve Nested CV ile hiperparametre optimizasyonu içeren uçtan uca bir pipeline kurulmuştur. Dört model tarafsız karşılaştırılmış; XGBoost (ROC-AUC 0,797, doğruluk %72,1) en başarılı model olarak belirlenmiş ve bağımsız test kümesinde (%72,76) doğrulanmıştır.</w:t>
       </w:r>
     </w:p>
     <w:p>
@@ -5277,28 +5277,16 @@
       <w:pPr>
         <w:spacing w:after="200"/>
       </w:pPr>
-      <w:r>
-        <w:rPr>
-          <w:color w:val="2E75B6"/>
-        </w:rPr>
-        <w:t xml:space="preserve">https://github.com/</w:t>
-      </w:r>
-      <w:r>
-        <w:rPr>
-          <w:i/>
-          <w:iCs/>
-          <w:color w:val="2E75B6"/>
-        </w:rPr>
-        <w:t xml:space="preserve">&lt;kullanıcı-adı&gt;/higgs-ml-pipeline</w:t>
-      </w:r>
-      <w:r>
-        <w:rPr>
-          <w:color w:val="808080"/>
-          <w:sz w:val="16"/>
-          <w:szCs w:val="16"/>
-        </w:rPr>
-        <w:t xml:space="preserve">   (yükleme sonrası güncellenecek)</w:t>
-      </w:r>
+      <w:hyperlink w:history="1" r:id="rIdfzksexsrfnnzvszgz7wza">
+        <w:r>
+          <w:rPr>
+            <w:rStyle w:val="Hyperlink"/>
+            <w:sz w:val="24"/>
+            <w:szCs w:val="24"/>
+          </w:rPr>
+          <w:t xml:space="preserve">https://github.com/yusufekrembm/Machine-Learning-Final-Odev</w:t>
+        </w:r>
+      </w:hyperlink>
     </w:p>
     <w:p>
       <w:r>

</xml_diff>

<commit_message>
Rapor kapak yili 2026 yapildi
</commit_message>
<xml_diff>
--- a/HIGGS_ML_Rapor.docx
+++ b/HIGGS_ML_Rapor.docx
@@ -159,7 +159,7 @@
           <w:sz w:val="24"/>
           <w:szCs w:val="24"/>
         </w:rPr>
-        <w:t xml:space="preserve">2025</w:t>
+        <w:t xml:space="preserve">2026</w:t>
       </w:r>
     </w:p>
     <w:p>
@@ -5277,7 +5277,7 @@
       <w:pPr>
         <w:spacing w:after="200"/>
       </w:pPr>
-      <w:hyperlink w:history="1" r:id="rId1dvjsjpqeezpwa_nengo9">
+      <w:hyperlink w:history="1" r:id="rIdwhxwge9gp9fwczxyx-t8b">
         <w:r>
           <w:rPr>
             <w:rStyle w:val="Hyperlink"/>
@@ -5324,7 +5324,7 @@
       <w:pPr>
         <w:spacing w:after="160"/>
       </w:pPr>
-      <w:hyperlink w:history="1" r:id="rIdc48u60lkhohiyhtf4owjf">
+      <w:hyperlink w:history="1" r:id="rIdxkuq1bbafgdusp9g5heqp">
         <w:r>
           <w:rPr>
             <w:rStyle w:val="Hyperlink"/>

</xml_diff>